<commit_message>
Rebrand to Springfield Concrete Group (Springfield, IL)
- Clean transparent SCG logos (stacked, horizontal, monogram, on-dark,
  one-color, SVG) + favicons/OG image; brand kit in brand/
- Public site: brand colors/fonts/copy from brand guide, IL service areas
- CRM/backend: SCG branding, America/Chicago, Supabase bootstrap.sql,
  .env.example and SETUP.md for a fresh Supabase + Vercel deploy

Co-Authored-By: Claude Opus 5.5 <noreply@anthropic.com>
Claude-Session: https://claude.ai/code/session_01GbhZqJ3sL6sBxnmaETk8cJ
</commit_message>
<xml_diff>
--- a/docs/INDEPENDENT CONTRACTOR AGREEMENT.docx
+++ b/docs/INDEPENDENT CONTRACTOR AGREEMENT.docx
@@ -59,7 +59,7 @@
           <w:u w:val="single"/>
           <w:rtl w:val="0"/>
         </w:rPr>
-        <w:t xml:space="preserve">Raleigh Concrete Group</w:t>
+        <w:t xml:space="preserve">Springfield Concrete Group</w:t>
       </w:r>
       <w:r>
         <w:rPr>
@@ -698,7 +698,7 @@
         <w:rPr>
           <w:rtl w:val="0"/>
         </w:rPr>
-        <w:t xml:space="preserve">This Agreement shall be governed by the laws of the State of North Carolina.</w:t>
+        <w:t xml:space="preserve">This Agreement shall be governed by the laws of the State of Illinois.</w:t>
       </w:r>
     </w:p>
     <w:p>
@@ -840,7 +840,7 @@
           <w:u w:val="single"/>
           <w:rtl w:val="0"/>
         </w:rPr>
-        <w:t xml:space="preserve">Raleigh Concrete Group</w:t>
+        <w:t xml:space="preserve">Springfield Concrete Group</w:t>
       </w:r>
     </w:p>
     <w:p>

</xml_diff>